<commit_message>
Update commandController & gestion SPI
</commit_message>
<xml_diff>
--- a/DOC/Listado_comandos_ARD10V1.0_Kernel_3.0.docx
+++ b/DOC/Listado_comandos_ARD10V1.0_Kernel_3.0.docx
@@ -1,6 +1,6 @@
 
 <file path=word/document.xml><?xml version="1.0" encoding="utf-8"?>
-<w:document xmlns:wpc="http://schemas.microsoft.com/office/word/2010/wordprocessingCanvas" xmlns:cx="http://schemas.microsoft.com/office/drawing/2014/chartex" xmlns:mc="http://schemas.openxmlformats.org/markup-compatibility/2006" xmlns:o="urn:schemas-microsoft-com:office:office" xmlns:r="http://schemas.openxmlformats.org/officeDocument/2006/relationships" xmlns:m="http://schemas.openxmlformats.org/officeDocument/2006/math" xmlns:v="urn:schemas-microsoft-com:vml" xmlns:wp14="http://schemas.microsoft.com/office/word/2010/wordprocessingDrawing" xmlns:wp="http://schemas.openxmlformats.org/drawingml/2006/wordprocessingDrawing" xmlns:w10="urn:schemas-microsoft-com:office:word" xmlns:w="http://schemas.openxmlformats.org/wordprocessingml/2006/main" xmlns:w14="http://schemas.microsoft.com/office/word/2010/wordml" xmlns:w15="http://schemas.microsoft.com/office/word/2012/wordml" xmlns:w16se="http://schemas.microsoft.com/office/word/2015/wordml/symex" xmlns:wpg="http://schemas.microsoft.com/office/word/2010/wordprocessingGroup" xmlns:wpi="http://schemas.microsoft.com/office/word/2010/wordprocessingInk" xmlns:wne="http://schemas.microsoft.com/office/word/2006/wordml" xmlns:wps="http://schemas.microsoft.com/office/word/2010/wordprocessingShape" mc:Ignorable="w14 w15 w16se wp14">
+<w:document xmlns:wpc="http://schemas.microsoft.com/office/word/2010/wordprocessingCanvas" xmlns:mc="http://schemas.openxmlformats.org/markup-compatibility/2006" xmlns:o="urn:schemas-microsoft-com:office:office" xmlns:r="http://schemas.openxmlformats.org/officeDocument/2006/relationships" xmlns:m="http://schemas.openxmlformats.org/officeDocument/2006/math" xmlns:v="urn:schemas-microsoft-com:vml" xmlns:wp14="http://schemas.microsoft.com/office/word/2010/wordprocessingDrawing" xmlns:wp="http://schemas.openxmlformats.org/drawingml/2006/wordprocessingDrawing" xmlns:w10="urn:schemas-microsoft-com:office:word" xmlns:w="http://schemas.openxmlformats.org/wordprocessingml/2006/main" xmlns:w14="http://schemas.microsoft.com/office/word/2010/wordml" xmlns:w15="http://schemas.microsoft.com/office/word/2012/wordml" xmlns:wpg="http://schemas.microsoft.com/office/word/2010/wordprocessingGroup" xmlns:wpi="http://schemas.microsoft.com/office/word/2010/wordprocessingInk" xmlns:wne="http://schemas.microsoft.com/office/word/2006/wordml" xmlns:wps="http://schemas.microsoft.com/office/word/2010/wordprocessingShape" mc:Ignorable="w14 w15 wp14">
   <w:body>
     <w:p>
       <w:r>
@@ -294,13 +294,8 @@
             </w:r>
           </w:p>
           <w:p>
-            <w:proofErr w:type="gramStart"/>
-            <w:r>
-              <w:t>{ 0</w:t>
-            </w:r>
-            <w:proofErr w:type="gramEnd"/>
-            <w:r>
-              <w:t xml:space="preserve">xAA 0x55 </w:t>
+            <w:r>
+              <w:t xml:space="preserve">{ 0xAA 0x55 </w:t>
             </w:r>
             <w:proofErr w:type="spellStart"/>
             <w:r>
@@ -624,21 +619,7 @@
               <w:rPr>
                 <w:lang w:val="en-US"/>
               </w:rPr>
-              <w:t xml:space="preserve">               </w:t>
-            </w:r>
-            <w:proofErr w:type="spellStart"/>
-            <w:r>
-              <w:rPr>
-                <w:lang w:val="en-US"/>
-              </w:rPr>
-              <w:t>Vmax</w:t>
-            </w:r>
-            <w:proofErr w:type="spellEnd"/>
-            <w:r>
-              <w:rPr>
-                <w:lang w:val="en-US"/>
-              </w:rPr>
-              <w:t xml:space="preserve">     Rx</w:t>
+              <w:t xml:space="preserve">               Vmax     Rx</w:t>
             </w:r>
           </w:p>
           <w:p>
@@ -1162,6 +1143,35 @@
           </w:tcPr>
           <w:p>
             <w:r>
+              <w:t>WR</w:t>
+            </w:r>
+          </w:p>
+        </w:tc>
+        <w:tc>
+          <w:tcPr>
+            <w:tcW w:w="7223" w:type="dxa"/>
+          </w:tcPr>
+          <w:p>
+            <w:proofErr w:type="spellStart"/>
+            <w:r>
+              <w:t>Reset</w:t>
+            </w:r>
+            <w:proofErr w:type="spellEnd"/>
+            <w:r>
+              <w:t xml:space="preserve"> de la placa arduino</w:t>
+            </w:r>
+            <w:bookmarkStart w:id="0" w:name="_GoBack"/>
+            <w:bookmarkEnd w:id="0"/>
+          </w:p>
+        </w:tc>
+      </w:tr>
+      <w:tr>
+        <w:tc>
+          <w:tcPr>
+            <w:tcW w:w="1271" w:type="dxa"/>
+          </w:tcPr>
+          <w:p>
+            <w:r>
               <w:t>WZ</w:t>
             </w:r>
           </w:p>
@@ -1232,11 +1242,11 @@
     </w:p>
     <w:p>
       <w:r>
-        <w:t>Formato de los parámetros:</w:t>
+        <w:t>Formato de los parámetros</w:t>
       </w:r>
       <w:proofErr w:type="gramStart"/>
       <w:r>
-        <w:t xml:space="preserve">  :</w:t>
+        <w:t>:  :</w:t>
       </w:r>
       <w:proofErr w:type="spellStart"/>
       <w:r>
@@ -1547,15 +1557,7 @@
             </w:r>
             <w:proofErr w:type="spellEnd"/>
             <w:r>
-              <w:t xml:space="preserve"> (</w:t>
-            </w:r>
-            <w:proofErr w:type="gramStart"/>
-            <w:r>
-              <w:t>MULTIPLICADOR)  para</w:t>
-            </w:r>
-            <w:proofErr w:type="gramEnd"/>
-            <w:r>
-              <w:t xml:space="preserve"> el </w:t>
+              <w:t xml:space="preserve"> (MULTIPLICADOR)  para el </w:t>
             </w:r>
             <w:proofErr w:type="spellStart"/>
             <w:r>
@@ -1617,15 +1619,7 @@
           </w:p>
           <w:p>
             <w:r>
-              <w:t>RP|19|Nr_</w:t>
-            </w:r>
-            <w:proofErr w:type="gramStart"/>
-            <w:r>
-              <w:t>Celula ,</w:t>
-            </w:r>
-            <w:proofErr w:type="gramEnd"/>
-            <w:r>
-              <w:t xml:space="preserve"> siendo </w:t>
+              <w:t xml:space="preserve">RP|19|Nr_Celula , siendo </w:t>
             </w:r>
             <w:proofErr w:type="spellStart"/>
             <w:r>
@@ -1729,15 +1723,7 @@
           <w:p/>
           <w:p>
             <w:r>
-              <w:t xml:space="preserve">Ejemplo: consultar la célula 4 (la células van del </w:t>
-            </w:r>
-            <w:proofErr w:type="gramStart"/>
-            <w:r>
-              <w:t>0..</w:t>
-            </w:r>
-            <w:proofErr w:type="gramEnd"/>
-            <w:r>
-              <w:t>4)</w:t>
+              <w:t>Ejemplo: consultar la célula 4 (la células van del 0..4)</w:t>
             </w:r>
           </w:p>
           <w:p>
@@ -1839,6 +1825,7 @@
           </w:tcPr>
           <w:p>
             <w:r>
+              <w:lastRenderedPageBreak/>
               <w:t>21</w:t>
             </w:r>
           </w:p>
@@ -1861,7 +1848,6 @@
           </w:tcPr>
           <w:p>
             <w:r>
-              <w:lastRenderedPageBreak/>
               <w:t>22</w:t>
             </w:r>
           </w:p>
@@ -1959,11 +1945,11 @@
     </w:p>
     <w:p>
       <w:r>
-        <w:t>Formato de los parámetros:</w:t>
+        <w:t>Formato de los parámetros</w:t>
       </w:r>
       <w:proofErr w:type="gramStart"/>
       <w:r>
-        <w:t xml:space="preserve">  :</w:t>
+        <w:t>:  :</w:t>
       </w:r>
       <w:proofErr w:type="spellStart"/>
       <w:r>
@@ -1992,12 +1978,13 @@
           <w:lang w:val="de-DE"/>
         </w:rPr>
       </w:pPr>
-      <w:r>
-        <w:t xml:space="preserve">por </w:t>
-      </w:r>
       <w:proofErr w:type="gramStart"/>
       <w:r>
-        <w:t>ejemp</w:t>
+        <w:t>por</w:t>
+      </w:r>
+      <w:proofErr w:type="gramEnd"/>
+      <w:r>
+        <w:t xml:space="preserve"> ejemp</w:t>
       </w:r>
       <w:r>
         <w:t>l</w:t>
@@ -2008,7 +1995,6 @@
       <w:r>
         <w:t>:</w:t>
       </w:r>
-      <w:proofErr w:type="gramEnd"/>
     </w:p>
     <w:p>
       <w:pPr>
@@ -2094,17 +2080,43 @@
           <w:b/>
           <w:bCs/>
         </w:rPr>
-        <w:t xml:space="preserve">Todas las escrituras de los datos se hacen en RAM, para que se guarden le EEPROM </w:t>
-      </w:r>
-      <w:proofErr w:type="spellStart"/>
+        <w:t>Todas las escrituras de los datos se hac</w:t>
+      </w:r>
       <w:r>
         <w:rPr>
           <w:b/>
           <w:bCs/>
         </w:rPr>
-        <w:t>intern</w:t>
-      </w:r>
-      <w:proofErr w:type="spellEnd"/>
+        <w:t xml:space="preserve">en en RAM, para que se guarden </w:t>
+      </w:r>
+      <w:r>
+        <w:rPr>
+          <w:b/>
+          <w:bCs/>
+        </w:rPr>
+        <w:t>e</w:t>
+      </w:r>
+      <w:r>
+        <w:rPr>
+          <w:b/>
+          <w:bCs/>
+        </w:rPr>
+        <w:t>n</w:t>
+      </w:r>
+      <w:r>
+        <w:rPr>
+          <w:b/>
+          <w:bCs/>
+        </w:rPr>
+        <w:t xml:space="preserve"> EEPROM intern</w:t>
+      </w:r>
+      <w:r>
+        <w:rPr>
+          <w:b/>
+          <w:bCs/>
+        </w:rPr>
+        <w:t>a</w:t>
+      </w:r>
       <w:r>
         <w:rPr>
           <w:b/>
@@ -2398,15 +2410,7 @@
             </w:r>
             <w:proofErr w:type="spellEnd"/>
             <w:r>
-              <w:t xml:space="preserve"> (</w:t>
-            </w:r>
-            <w:proofErr w:type="gramStart"/>
-            <w:r>
-              <w:t>MULTIPLICADOR)  para</w:t>
-            </w:r>
-            <w:proofErr w:type="gramEnd"/>
-            <w:r>
-              <w:t xml:space="preserve"> el </w:t>
+              <w:t xml:space="preserve"> (MULTIPLICADOR)  para el </w:t>
             </w:r>
             <w:proofErr w:type="spellStart"/>
             <w:r>
@@ -2471,15 +2475,7 @@
           </w:p>
           <w:p>
             <w:r>
-              <w:t>RP|19|Nr_</w:t>
-            </w:r>
-            <w:proofErr w:type="gramStart"/>
-            <w:r>
-              <w:t>Celula ,</w:t>
-            </w:r>
-            <w:proofErr w:type="gramEnd"/>
-            <w:r>
-              <w:t xml:space="preserve"> siendo </w:t>
+              <w:t xml:space="preserve">RP|19|Nr_Celula , siendo </w:t>
             </w:r>
             <w:proofErr w:type="spellStart"/>
             <w:r>
@@ -2633,15 +2629,7 @@
           </w:tcPr>
           <w:p>
             <w:r>
-              <w:t xml:space="preserve">Forzar la activación </w:t>
-            </w:r>
-            <w:proofErr w:type="gramStart"/>
-            <w:r>
-              <w:t>de  una</w:t>
-            </w:r>
-            <w:proofErr w:type="gramEnd"/>
-            <w:r>
-              <w:t xml:space="preserve"> célula por software, saltándose la detección automática de hardware.</w:t>
+              <w:t>Forzar la activación de  una célula por software, saltándose la detección automática de hardware.</w:t>
             </w:r>
           </w:p>
           <w:p/>
@@ -2966,8 +2954,6 @@
           <w:u w:val="single"/>
         </w:rPr>
       </w:pPr>
-      <w:bookmarkStart w:id="0" w:name="_GoBack"/>
-      <w:bookmarkEnd w:id="0"/>
     </w:p>
     <w:sectPr>
       <w:pgSz w:w="11906" w:h="16838"/>
@@ -2980,7 +2966,7 @@
 </file>
 
 <file path=word/styles.xml><?xml version="1.0" encoding="utf-8"?>
-<w:styles xmlns:mc="http://schemas.openxmlformats.org/markup-compatibility/2006" xmlns:r="http://schemas.openxmlformats.org/officeDocument/2006/relationships" xmlns:w="http://schemas.openxmlformats.org/wordprocessingml/2006/main" xmlns:w14="http://schemas.microsoft.com/office/word/2010/wordml" xmlns:w15="http://schemas.microsoft.com/office/word/2012/wordml" xmlns:w16se="http://schemas.microsoft.com/office/word/2015/wordml/symex" mc:Ignorable="w14 w15 w16se">
+<w:styles xmlns:mc="http://schemas.openxmlformats.org/markup-compatibility/2006" xmlns:r="http://schemas.openxmlformats.org/officeDocument/2006/relationships" xmlns:w="http://schemas.openxmlformats.org/wordprocessingml/2006/main" xmlns:w14="http://schemas.microsoft.com/office/word/2010/wordml" xmlns:w15="http://schemas.microsoft.com/office/word/2012/wordml" mc:Ignorable="w14 w15">
   <w:docDefaults>
     <w:rPrDefault>
       <w:rPr>

</xml_diff>